<commit_message>
Commit para ultima revisao antes de finalizar
</commit_message>
<xml_diff>
--- a/arquivos enviados/A HISTÓRIA DA INFORMÁTICA.docx
+++ b/arquivos enviados/A HISTÓRIA DA INFORMÁTICA.docx
@@ -410,20 +410,8 @@
           <w:sz w:val="24"/>
           <w:szCs w:val="24"/>
         </w:rPr>
-        <w:t xml:space="preserve">Conforme Marilza de Lourdes </w:t>
-      </w:r>
-      <w:proofErr w:type="spellStart"/>
-      <w:r>
-        <w:rPr>
-          <w:rFonts w:ascii="Arial" w:hAnsi="Arial" w:cs="Arial"/>
-          <w:i/>
-          <w:iCs/>
-          <w:sz w:val="24"/>
-          <w:szCs w:val="24"/>
-        </w:rPr>
-        <w:t>Cardi</w:t>
-      </w:r>
-      <w:proofErr w:type="spellEnd"/>
+        <w:t>Conforme Marilza de Lourdes Cardi</w:t>
+      </w:r>
     </w:p>
     <w:p>
       <w:pPr>
@@ -534,25 +522,7 @@
           <w:sz w:val="24"/>
           <w:szCs w:val="24"/>
         </w:rPr>
-        <w:t xml:space="preserve"> cálculos e riscos em paredes) em vários locais. Por exemplo, a caverna de </w:t>
-      </w:r>
-      <w:proofErr w:type="spellStart"/>
-      <w:r>
-        <w:rPr>
-          <w:rFonts w:ascii="Arial" w:hAnsi="Arial" w:cs="Arial"/>
-          <w:sz w:val="24"/>
-          <w:szCs w:val="24"/>
-        </w:rPr>
-        <w:t>Goyet</w:t>
-      </w:r>
-      <w:proofErr w:type="spellEnd"/>
-      <w:r>
-        <w:rPr>
-          <w:rFonts w:ascii="Arial" w:hAnsi="Arial" w:cs="Arial"/>
-          <w:sz w:val="24"/>
-          <w:szCs w:val="24"/>
-        </w:rPr>
-        <w:t>, perto de Namur, na Bélgica foi transformada em museu onde se pode ver como deveriam viver nossos antepassados 60.000 anos atrás e a Figura 1 mostra riscos de parede provavelmente sistema de contagem.</w:t>
+        <w:t> cálculos e riscos em paredes) em vários locais. Por exemplo, a caverna de Goyet, perto de Namur, na Bélgica foi transformada em museu onde se pode ver como deveriam viver nossos antepassados 60.000 anos atrás e a Figura 1 mostra riscos de parede provavelmente sistema de contagem.</w:t>
       </w:r>
     </w:p>
     <w:p>
@@ -1988,18 +1958,8 @@
           <w:sz w:val="24"/>
           <w:szCs w:val="24"/>
         </w:rPr>
-        <w:t xml:space="preserve">Em torno de 1623, </w:t>
-      </w:r>
-      <w:proofErr w:type="spellStart"/>
-      <w:r>
-        <w:rPr>
-          <w:rFonts w:ascii="Arial" w:hAnsi="Arial" w:cs="Arial"/>
-          <w:sz w:val="24"/>
-          <w:szCs w:val="24"/>
-        </w:rPr>
-        <w:t>Whilhelm</w:t>
-      </w:r>
-      <w:proofErr w:type="spellEnd"/>
+        <w:t>Em torno de 1623, Whilhelm Schickard construiu uma calculadora mecânica capaz de multiplicar através do método sucessivo de soma.</w:t>
+      </w:r>
       <w:r>
         <w:rPr>
           <w:rFonts w:ascii="Arial" w:hAnsi="Arial" w:cs="Arial"/>
@@ -2008,23 +1968,13 @@
         </w:rPr>
         <w:t xml:space="preserve"> </w:t>
       </w:r>
-      <w:proofErr w:type="spellStart"/>
-      <w:r>
-        <w:rPr>
-          <w:rFonts w:ascii="Arial" w:hAnsi="Arial" w:cs="Arial"/>
-          <w:sz w:val="24"/>
-          <w:szCs w:val="24"/>
-        </w:rPr>
-        <w:t>Schickard</w:t>
-      </w:r>
-      <w:proofErr w:type="spellEnd"/>
-      <w:r>
-        <w:rPr>
-          <w:rFonts w:ascii="Arial" w:hAnsi="Arial" w:cs="Arial"/>
-          <w:sz w:val="24"/>
-          <w:szCs w:val="24"/>
-        </w:rPr>
-        <w:t xml:space="preserve"> construiu uma calculadora mecânica capaz de multiplicar através do método sucessivo de soma.</w:t>
+      <w:r>
+        <w:rPr>
+          <w:rFonts w:ascii="Arial" w:hAnsi="Arial" w:cs="Arial"/>
+          <w:sz w:val="24"/>
+          <w:szCs w:val="24"/>
+        </w:rPr>
+        <w:t>Somente em 1957 que a existência desta calculadora tornou-se conhecida.</w:t>
       </w:r>
       <w:r>
         <w:rPr>
@@ -2040,7 +1990,7 @@
           <w:sz w:val="24"/>
           <w:szCs w:val="24"/>
         </w:rPr>
-        <w:t>Somente em 1957 que a existência desta calculadora tornou-se conhecida.</w:t>
+        <w:t>Em 1642, Blaise Pascal, filósofo, físico e matemático francês, aos 18 anos, desenvolveu uma máquina de calcular, para auxiliar o</w:t>
       </w:r>
       <w:r>
         <w:rPr>
@@ -2056,7 +2006,7 @@
           <w:sz w:val="24"/>
           <w:szCs w:val="24"/>
         </w:rPr>
-        <w:t>Em 1642, Blaise Pascal, filósofo, físico e matemático francês, aos 18 anos, desenvolveu uma máquina de calcular, para auxiliar o</w:t>
+        <w:t>trabalho de contabilidade, baseada em pequenos discos. A máquina utilizava o sistema decimal para os seus cálculos de maneira que quando um disco ultrapassava o valor 9, retornava ao 0 e aumentava uma unidade no disco imediatamente superior.</w:t>
       </w:r>
       <w:r>
         <w:rPr>
@@ -2072,25 +2022,8 @@
           <w:sz w:val="24"/>
           <w:szCs w:val="24"/>
         </w:rPr>
-        <w:t>trabalho de contabilidade, baseada em pequenos discos. A máquina utilizava o sistema decimal para os seus cálculos de maneira que quando um disco ultrapassava o valor 9, retornava ao 0 e aumentava uma unidade no disco imediatamente superior.</w:t>
-      </w:r>
-      <w:r>
-        <w:rPr>
-          <w:rFonts w:ascii="Arial" w:hAnsi="Arial" w:cs="Arial"/>
-          <w:sz w:val="24"/>
-          <w:szCs w:val="24"/>
-        </w:rPr>
-        <w:t xml:space="preserve"> </w:t>
-      </w:r>
-      <w:r>
-        <w:rPr>
-          <w:rFonts w:ascii="Arial" w:hAnsi="Arial" w:cs="Arial"/>
-          <w:sz w:val="24"/>
-          <w:szCs w:val="24"/>
-        </w:rPr>
         <w:t>A máquina de calcular ficou conhecida como </w:t>
       </w:r>
-      <w:proofErr w:type="spellStart"/>
       <w:r>
         <w:rPr>
           <w:rFonts w:ascii="Arial" w:hAnsi="Arial" w:cs="Arial"/>
@@ -2101,7 +2034,6 @@
         </w:rPr>
         <w:t>Pascaline</w:t>
       </w:r>
-      <w:proofErr w:type="spellEnd"/>
       <w:r>
         <w:rPr>
           <w:rFonts w:ascii="Arial" w:hAnsi="Arial" w:cs="Arial"/>
@@ -2124,25 +2056,7 @@
           <w:sz w:val="24"/>
           <w:szCs w:val="24"/>
         </w:rPr>
-        <w:t xml:space="preserve"> no comércio as máquinas de calcular, descendentes da </w:t>
-      </w:r>
-      <w:proofErr w:type="spellStart"/>
-      <w:r>
-        <w:rPr>
-          <w:rFonts w:ascii="Arial" w:hAnsi="Arial" w:cs="Arial"/>
-          <w:sz w:val="24"/>
-          <w:szCs w:val="24"/>
-        </w:rPr>
-        <w:t>Pascaline</w:t>
-      </w:r>
-      <w:proofErr w:type="spellEnd"/>
-      <w:r>
-        <w:rPr>
-          <w:rFonts w:ascii="Arial" w:hAnsi="Arial" w:cs="Arial"/>
-          <w:sz w:val="24"/>
-          <w:szCs w:val="24"/>
-        </w:rPr>
-        <w:t>. </w:t>
+        <w:t xml:space="preserve"> no comércio as máquinas de calcular, descendentes da Pascaline. </w:t>
       </w:r>
     </w:p>
     <w:p>
@@ -2168,7 +2082,7 @@
         <w:tblLook w:val="04A0" w:firstRow="1" w:lastRow="0" w:firstColumn="1" w:lastColumn="0" w:noHBand="0" w:noVBand="1"/>
       </w:tblPr>
       <w:tblGrid>
-        <w:gridCol w:w="4606"/>
+        <w:gridCol w:w="4503"/>
         <w:gridCol w:w="4809"/>
       </w:tblGrid>
       <w:tr>
@@ -2360,18 +2274,8 @@
                 <w:sz w:val="24"/>
                 <w:szCs w:val="24"/>
               </w:rPr>
-              <w:t xml:space="preserve">Figura 8 - </w:t>
+              <w:t>Figura 8 - Pascaline</w:t>
             </w:r>
-            <w:proofErr w:type="spellStart"/>
-            <w:r>
-              <w:rPr>
-                <w:rFonts w:ascii="Arial" w:hAnsi="Arial" w:cs="Arial"/>
-                <w:sz w:val="24"/>
-                <w:szCs w:val="24"/>
-              </w:rPr>
-              <w:t>Pascaline</w:t>
-            </w:r>
-            <w:proofErr w:type="spellEnd"/>
           </w:p>
         </w:tc>
       </w:tr>
@@ -2500,18 +2404,8 @@
                 <w:sz w:val="24"/>
                 <w:szCs w:val="24"/>
               </w:rPr>
-              <w:t xml:space="preserve"> Figura 9 – G. W. von </w:t>
+              <w:t> Figura 9 – G. W. von Leibnitz</w:t>
             </w:r>
-            <w:proofErr w:type="spellStart"/>
-            <w:r>
-              <w:rPr>
-                <w:rFonts w:ascii="Arial" w:hAnsi="Arial" w:cs="Arial"/>
-                <w:sz w:val="24"/>
-                <w:szCs w:val="24"/>
-              </w:rPr>
-              <w:t>Leibnitz</w:t>
-            </w:r>
-            <w:proofErr w:type="spellEnd"/>
           </w:p>
         </w:tc>
       </w:tr>
@@ -2555,43 +2449,7 @@
           <w:sz w:val="24"/>
           <w:szCs w:val="24"/>
         </w:rPr>
-        <w:t xml:space="preserve">O matemático alemão, Gottfried Wilhelm von </w:t>
-      </w:r>
-      <w:proofErr w:type="spellStart"/>
-      <w:r>
-        <w:rPr>
-          <w:rFonts w:ascii="Arial" w:hAnsi="Arial" w:cs="Arial"/>
-          <w:sz w:val="24"/>
-          <w:szCs w:val="24"/>
-        </w:rPr>
-        <w:t>Leibnitz</w:t>
-      </w:r>
-      <w:proofErr w:type="spellEnd"/>
-      <w:r>
-        <w:rPr>
-          <w:rFonts w:ascii="Arial" w:hAnsi="Arial" w:cs="Arial"/>
-          <w:sz w:val="24"/>
-          <w:szCs w:val="24"/>
-        </w:rPr>
-        <w:t xml:space="preserve"> aprimorou a </w:t>
-      </w:r>
-      <w:proofErr w:type="spellStart"/>
-      <w:r>
-        <w:rPr>
-          <w:rFonts w:ascii="Arial" w:hAnsi="Arial" w:cs="Arial"/>
-          <w:sz w:val="24"/>
-          <w:szCs w:val="24"/>
-        </w:rPr>
-        <w:t>Pascaline</w:t>
-      </w:r>
-      <w:proofErr w:type="spellEnd"/>
-      <w:r>
-        <w:rPr>
-          <w:rFonts w:ascii="Arial" w:hAnsi="Arial" w:cs="Arial"/>
-          <w:sz w:val="24"/>
-          <w:szCs w:val="24"/>
-        </w:rPr>
-        <w:t xml:space="preserve"> criando um modelo capaz também de multiplicar, dividir e extrair raízes quadradas, através de adições e subtrações sucessivas, obtendo a</w:t>
+        <w:t>O matemático alemão, Gottfried Wilhelm von Leibnitz aprimorou a Pascaline criando um modelo capaz também de multiplicar, dividir e extrair raízes quadradas, através de adições e subtrações sucessivas, obtendo a</w:t>
       </w:r>
       <w:r>
         <w:rPr>
@@ -2609,9 +2467,16 @@
           <w:sz w:val="24"/>
           <w:szCs w:val="24"/>
         </w:rPr>
-        <w:t xml:space="preserve">Calculadora Universal de </w:t>
-      </w:r>
-      <w:proofErr w:type="spellStart"/>
+        <w:t>Calculadora Universal de Leibnitz,</w:t>
+      </w:r>
+      <w:r>
+        <w:rPr>
+          <w:rFonts w:ascii="Arial" w:hAnsi="Arial" w:cs="Arial"/>
+          <w:sz w:val="24"/>
+          <w:szCs w:val="24"/>
+        </w:rPr>
+        <w:t> também conhecida como </w:t>
+      </w:r>
       <w:r>
         <w:rPr>
           <w:rFonts w:ascii="Arial" w:hAnsi="Arial" w:cs="Arial"/>
@@ -2620,96 +2485,27 @@
           <w:sz w:val="24"/>
           <w:szCs w:val="24"/>
         </w:rPr>
-        <w:t>Leibnitz</w:t>
-      </w:r>
-      <w:proofErr w:type="spellEnd"/>
-      <w:r>
-        <w:rPr>
-          <w:rFonts w:ascii="Arial" w:hAnsi="Arial" w:cs="Arial"/>
-          <w:i/>
-          <w:iCs/>
-          <w:sz w:val="24"/>
-          <w:szCs w:val="24"/>
-        </w:rPr>
-        <w:t>,</w:t>
-      </w:r>
-      <w:r>
-        <w:rPr>
-          <w:rFonts w:ascii="Arial" w:hAnsi="Arial" w:cs="Arial"/>
-          <w:sz w:val="24"/>
-          <w:szCs w:val="24"/>
-        </w:rPr>
-        <w:t> também conhecida como </w:t>
-      </w:r>
-      <w:r>
-        <w:rPr>
-          <w:rFonts w:ascii="Arial" w:hAnsi="Arial" w:cs="Arial"/>
-          <w:i/>
-          <w:iCs/>
-          <w:sz w:val="24"/>
-          <w:szCs w:val="24"/>
-        </w:rPr>
-        <w:t xml:space="preserve">Máquina de </w:t>
-      </w:r>
-      <w:proofErr w:type="spellStart"/>
-      <w:r>
-        <w:rPr>
-          <w:rFonts w:ascii="Arial" w:hAnsi="Arial" w:cs="Arial"/>
-          <w:i/>
-          <w:iCs/>
-          <w:sz w:val="24"/>
-          <w:szCs w:val="24"/>
-        </w:rPr>
-        <w:t>Leibnitz</w:t>
-      </w:r>
-      <w:proofErr w:type="spellEnd"/>
-      <w:r>
-        <w:rPr>
-          <w:rFonts w:ascii="Arial" w:hAnsi="Arial" w:cs="Arial"/>
-          <w:i/>
-          <w:iCs/>
-          <w:sz w:val="24"/>
-          <w:szCs w:val="24"/>
-        </w:rPr>
-        <w:t>.</w:t>
-      </w:r>
-    </w:p>
-    <w:p>
-      <w:pPr>
-        <w:spacing w:after="0" w:line="240" w:lineRule="auto"/>
-        <w:ind w:right="-1" w:firstLine="709"/>
-        <w:jc w:val="both"/>
-        <w:rPr>
-          <w:rFonts w:ascii="Arial" w:hAnsi="Arial" w:cs="Arial"/>
-          <w:sz w:val="24"/>
-          <w:szCs w:val="24"/>
-        </w:rPr>
-      </w:pPr>
-      <w:r>
-        <w:rPr>
-          <w:rFonts w:ascii="Arial" w:hAnsi="Arial" w:cs="Arial"/>
-          <w:sz w:val="24"/>
-          <w:szCs w:val="24"/>
-        </w:rPr>
-        <w:t xml:space="preserve">Em 1673, ficou pronta a calculadora mecânica, que se distinguia por possuir três elementos significativos. A porção aditiva era, essencialmente, idêntica à da </w:t>
-      </w:r>
-      <w:proofErr w:type="spellStart"/>
-      <w:r>
-        <w:rPr>
-          <w:rFonts w:ascii="Arial" w:hAnsi="Arial" w:cs="Arial"/>
-          <w:sz w:val="24"/>
-          <w:szCs w:val="24"/>
-        </w:rPr>
-        <w:t>Pascaline</w:t>
-      </w:r>
-      <w:proofErr w:type="spellEnd"/>
-      <w:r>
-        <w:rPr>
-          <w:rFonts w:ascii="Arial" w:hAnsi="Arial" w:cs="Arial"/>
-          <w:sz w:val="24"/>
-          <w:szCs w:val="24"/>
-        </w:rPr>
-        <w:t>, mas Leibniz incluiu um componente móvel e uma manivela manual, que ficava ao lado e acionava uma roda dentada - ou, nas versões posteriores, cilindros - dentro da máquina. Este mecanismo funcionava, com o componente móvel, para acelerar as adições repetidas envolvidas nas operações de multiplicação e divisão.</w:t>
+        <w:t>Máquina de Leibnitz.</w:t>
+      </w:r>
+    </w:p>
+    <w:p>
+      <w:pPr>
+        <w:spacing w:after="0" w:line="240" w:lineRule="auto"/>
+        <w:ind w:right="-1" w:firstLine="709"/>
+        <w:jc w:val="both"/>
+        <w:rPr>
+          <w:rFonts w:ascii="Arial" w:hAnsi="Arial" w:cs="Arial"/>
+          <w:sz w:val="24"/>
+          <w:szCs w:val="24"/>
+        </w:rPr>
+      </w:pPr>
+      <w:r>
+        <w:rPr>
+          <w:rFonts w:ascii="Arial" w:hAnsi="Arial" w:cs="Arial"/>
+          <w:sz w:val="24"/>
+          <w:szCs w:val="24"/>
+        </w:rPr>
+        <w:t>Em 1673, ficou pronta a calculadora mecânica, que se distinguia por possuir três elementos significativos. A porção aditiva era, essencialmente, idêntica à da Pascaline, mas Leibniz incluiu um componente móvel e uma manivela manual, que ficava ao lado e acionava uma roda dentada - ou, nas versões posteriores, cilindros - dentro da máquina. Este mecanismo funcionava, com o componente móvel, para acelerar as adições repetidas envolvidas nas operações de multiplicação e divisão.</w:t>
       </w:r>
     </w:p>
     <w:tbl>
@@ -2826,18 +2622,8 @@
                 <w:szCs w:val="24"/>
               </w:rPr>
               <w:br/>
-              <w:t xml:space="preserve">Figura 10 - Calculadora Universal de </w:t>
+              <w:t>Figura 10 - Calculadora Universal de Leibnitz</w:t>
             </w:r>
-            <w:proofErr w:type="spellStart"/>
-            <w:r>
-              <w:rPr>
-                <w:rFonts w:ascii="Arial" w:hAnsi="Arial" w:cs="Arial"/>
-                <w:sz w:val="24"/>
-                <w:szCs w:val="24"/>
-              </w:rPr>
-              <w:t>Leibnitz</w:t>
-            </w:r>
-            <w:proofErr w:type="spellEnd"/>
           </w:p>
         </w:tc>
       </w:tr>
@@ -3023,25 +2809,7 @@
           <w:sz w:val="24"/>
           <w:szCs w:val="24"/>
         </w:rPr>
-        <w:t>a principal motivação de </w:t>
-      </w:r>
-      <w:proofErr w:type="spellStart"/>
-      <w:r>
-        <w:rPr>
-          <w:rFonts w:ascii="Arial" w:hAnsi="Arial" w:cs="Arial"/>
-          <w:sz w:val="24"/>
-          <w:szCs w:val="24"/>
-        </w:rPr>
-        <w:t>Leibnitz</w:t>
-      </w:r>
-      <w:proofErr w:type="spellEnd"/>
-      <w:r>
-        <w:rPr>
-          <w:rFonts w:ascii="Arial" w:hAnsi="Arial" w:cs="Arial"/>
-          <w:sz w:val="24"/>
-          <w:szCs w:val="24"/>
-        </w:rPr>
-        <w:t xml:space="preserve"> em construir esta máquina pois seu pai era contador. Na época</w:t>
+        <w:t>a principal motivação de Leibnitz em construir esta máquina pois seu pai era contador. Na época</w:t>
       </w:r>
       <w:r>
         <w:rPr>
@@ -3057,43 +2825,7 @@
           <w:sz w:val="24"/>
           <w:szCs w:val="24"/>
         </w:rPr>
-        <w:t xml:space="preserve">as subdivisões das moedas não seguiam a base decimal e os cálculos de conversão eram árduos. Imagine-se por exemplo a Inglaterra, com a Libra dividida em 20 </w:t>
-      </w:r>
-      <w:proofErr w:type="spellStart"/>
-      <w:r>
-        <w:rPr>
-          <w:rFonts w:ascii="Arial" w:hAnsi="Arial" w:cs="Arial"/>
-          <w:sz w:val="24"/>
-          <w:szCs w:val="24"/>
-        </w:rPr>
-        <w:t>schillings</w:t>
-      </w:r>
-      <w:proofErr w:type="spellEnd"/>
-      <w:r>
-        <w:rPr>
-          <w:rFonts w:ascii="Arial" w:hAnsi="Arial" w:cs="Arial"/>
-          <w:sz w:val="24"/>
-          <w:szCs w:val="24"/>
-        </w:rPr>
-        <w:t xml:space="preserve"> e cada </w:t>
-      </w:r>
-      <w:proofErr w:type="spellStart"/>
-      <w:r>
-        <w:rPr>
-          <w:rFonts w:ascii="Arial" w:hAnsi="Arial" w:cs="Arial"/>
-          <w:sz w:val="24"/>
-          <w:szCs w:val="24"/>
-        </w:rPr>
-        <w:t>shilling</w:t>
-      </w:r>
-      <w:proofErr w:type="spellEnd"/>
-      <w:r>
-        <w:rPr>
-          <w:rFonts w:ascii="Arial" w:hAnsi="Arial" w:cs="Arial"/>
-          <w:sz w:val="24"/>
-          <w:szCs w:val="24"/>
-        </w:rPr>
-        <w:t xml:space="preserve"> em 12 pence, mas ainda tendo uma</w:t>
+        <w:t>as subdivisões das moedas não seguiam a base decimal e os cálculos de conversão eram árduos. Imagine-se por exemplo a Inglaterra, com a Libra dividida em 20 schillings e cada shilling em 12 pence, mas ainda tendo uma</w:t>
       </w:r>
       <w:r>
         <w:rPr>
@@ -3103,25 +2835,46 @@
         </w:rPr>
         <w:t xml:space="preserve"> </w:t>
       </w:r>
-      <w:proofErr w:type="spellStart"/>
-      <w:r>
-        <w:rPr>
-          <w:rFonts w:ascii="Arial" w:hAnsi="Arial" w:cs="Arial"/>
-          <w:sz w:val="24"/>
-          <w:szCs w:val="24"/>
-        </w:rPr>
-        <w:t>guinee</w:t>
-      </w:r>
-      <w:proofErr w:type="spellEnd"/>
-      <w:r>
-        <w:rPr>
-          <w:rFonts w:ascii="Arial" w:hAnsi="Arial" w:cs="Arial"/>
-          <w:sz w:val="24"/>
-          <w:szCs w:val="24"/>
-        </w:rPr>
-        <w:t xml:space="preserve"> valendo 21 </w:t>
-      </w:r>
-      <w:proofErr w:type="spellStart"/>
+      <w:r>
+        <w:rPr>
+          <w:rFonts w:ascii="Arial" w:hAnsi="Arial" w:cs="Arial"/>
+          <w:sz w:val="24"/>
+          <w:szCs w:val="24"/>
+        </w:rPr>
+        <w:t xml:space="preserve">guinee valendo 21 shillings! Quanto seria em </w:t>
+      </w:r>
+      <w:r>
+        <w:rPr>
+          <w:rFonts w:ascii="Arial" w:hAnsi="Arial" w:cs="Arial"/>
+          <w:sz w:val="24"/>
+          <w:szCs w:val="24"/>
+        </w:rPr>
+        <w:t>dólar</w:t>
+      </w:r>
+      <w:r>
+        <w:rPr>
+          <w:rFonts w:ascii="Arial" w:hAnsi="Arial" w:cs="Arial"/>
+          <w:sz w:val="24"/>
+          <w:szCs w:val="24"/>
+        </w:rPr>
+        <w:t xml:space="preserve">, se 1 </w:t>
+      </w:r>
+      <w:r>
+        <w:rPr>
+          <w:rFonts w:ascii="Arial" w:hAnsi="Arial" w:cs="Arial"/>
+          <w:sz w:val="24"/>
+          <w:szCs w:val="24"/>
+        </w:rPr>
+        <w:t>dólar</w:t>
+      </w:r>
+      <w:r>
+        <w:rPr>
+          <w:rFonts w:ascii="Arial" w:hAnsi="Arial" w:cs="Arial"/>
+          <w:sz w:val="24"/>
+          <w:szCs w:val="24"/>
+        </w:rPr>
+        <w:t xml:space="preserve"> fosse 1/2 guinee 5 </w:t>
+      </w:r>
       <w:r>
         <w:rPr>
           <w:rFonts w:ascii="Arial" w:hAnsi="Arial" w:cs="Arial"/>
@@ -3130,118 +2883,13 @@
         </w:rPr>
         <w:t>shillings</w:t>
       </w:r>
-      <w:proofErr w:type="spellEnd"/>
-      <w:r>
-        <w:rPr>
-          <w:rFonts w:ascii="Arial" w:hAnsi="Arial" w:cs="Arial"/>
-          <w:sz w:val="24"/>
-          <w:szCs w:val="24"/>
-        </w:rPr>
-        <w:t xml:space="preserve">! Quanto seria em </w:t>
-      </w:r>
-      <w:r>
-        <w:rPr>
-          <w:rFonts w:ascii="Arial" w:hAnsi="Arial" w:cs="Arial"/>
-          <w:sz w:val="24"/>
-          <w:szCs w:val="24"/>
-        </w:rPr>
-        <w:t>dólar</w:t>
-      </w:r>
-      <w:r>
-        <w:rPr>
-          <w:rFonts w:ascii="Arial" w:hAnsi="Arial" w:cs="Arial"/>
-          <w:sz w:val="24"/>
-          <w:szCs w:val="24"/>
-        </w:rPr>
-        <w:t xml:space="preserve">, se 1 </w:t>
-      </w:r>
-      <w:r>
-        <w:rPr>
-          <w:rFonts w:ascii="Arial" w:hAnsi="Arial" w:cs="Arial"/>
-          <w:sz w:val="24"/>
-          <w:szCs w:val="24"/>
-        </w:rPr>
-        <w:t>dólar</w:t>
-      </w:r>
-      <w:r>
-        <w:rPr>
-          <w:rFonts w:ascii="Arial" w:hAnsi="Arial" w:cs="Arial"/>
-          <w:sz w:val="24"/>
-          <w:szCs w:val="24"/>
-        </w:rPr>
-        <w:t xml:space="preserve"> fosse 1/2 </w:t>
-      </w:r>
-      <w:proofErr w:type="spellStart"/>
-      <w:r>
-        <w:rPr>
-          <w:rFonts w:ascii="Arial" w:hAnsi="Arial" w:cs="Arial"/>
-          <w:sz w:val="24"/>
-          <w:szCs w:val="24"/>
-        </w:rPr>
-        <w:t>guinee</w:t>
-      </w:r>
-      <w:proofErr w:type="spellEnd"/>
-      <w:r>
-        <w:rPr>
-          <w:rFonts w:ascii="Arial" w:hAnsi="Arial" w:cs="Arial"/>
-          <w:sz w:val="24"/>
-          <w:szCs w:val="24"/>
-        </w:rPr>
-        <w:t xml:space="preserve"> 5 </w:t>
-      </w:r>
-      <w:proofErr w:type="spellStart"/>
-      <w:r>
-        <w:rPr>
-          <w:rFonts w:ascii="Arial" w:hAnsi="Arial" w:cs="Arial"/>
-          <w:sz w:val="24"/>
-          <w:szCs w:val="24"/>
-        </w:rPr>
-        <w:t>shillings</w:t>
-      </w:r>
-      <w:proofErr w:type="spellEnd"/>
-      <w:r>
-        <w:rPr>
-          <w:rFonts w:ascii="Arial" w:hAnsi="Arial" w:cs="Arial"/>
-          <w:sz w:val="24"/>
-          <w:szCs w:val="24"/>
-        </w:rPr>
-        <w:t xml:space="preserve"> e 3 pence, um terno que custasse 5 </w:t>
-      </w:r>
-      <w:proofErr w:type="spellStart"/>
-      <w:r>
-        <w:rPr>
-          <w:rFonts w:ascii="Arial" w:hAnsi="Arial" w:cs="Arial"/>
-          <w:sz w:val="24"/>
-          <w:szCs w:val="24"/>
-        </w:rPr>
-        <w:t>guinee</w:t>
-      </w:r>
-      <w:proofErr w:type="spellEnd"/>
-      <w:r>
-        <w:rPr>
-          <w:rFonts w:ascii="Arial" w:hAnsi="Arial" w:cs="Arial"/>
-          <w:sz w:val="24"/>
-          <w:szCs w:val="24"/>
-        </w:rPr>
-        <w:t xml:space="preserve"> 2 </w:t>
-      </w:r>
-      <w:proofErr w:type="spellStart"/>
-      <w:r>
-        <w:rPr>
-          <w:rFonts w:ascii="Arial" w:hAnsi="Arial" w:cs="Arial"/>
-          <w:sz w:val="24"/>
-          <w:szCs w:val="24"/>
-        </w:rPr>
-        <w:t>shillings</w:t>
-      </w:r>
-      <w:proofErr w:type="spellEnd"/>
-      <w:r>
-        <w:rPr>
-          <w:rFonts w:ascii="Arial" w:hAnsi="Arial" w:cs="Arial"/>
-          <w:sz w:val="24"/>
-          <w:szCs w:val="24"/>
-        </w:rPr>
-        <w:t xml:space="preserve"> e 9 pence? Bom isto é </w:t>
+      <w:r>
+        <w:rPr>
+          <w:rFonts w:ascii="Arial" w:hAnsi="Arial" w:cs="Arial"/>
+          <w:sz w:val="24"/>
+          <w:szCs w:val="24"/>
+        </w:rPr>
+        <w:t xml:space="preserve"> e 3 pence, um terno que custasse 5 guinee 2 shillings e 9 pence? Bom isto é </w:t>
       </w:r>
       <w:r>
         <w:rPr>
@@ -3289,25 +2937,7 @@
           <w:sz w:val="24"/>
           <w:szCs w:val="24"/>
         </w:rPr>
-        <w:t xml:space="preserve"> dividida de modo análogo? Não causa admiração saber que a mãe de </w:t>
-      </w:r>
-      <w:proofErr w:type="spellStart"/>
-      <w:r>
-        <w:rPr>
-          <w:rFonts w:ascii="Arial" w:hAnsi="Arial" w:cs="Arial"/>
-          <w:sz w:val="24"/>
-          <w:szCs w:val="24"/>
-        </w:rPr>
-        <w:t>Leibnitz</w:t>
-      </w:r>
-      <w:proofErr w:type="spellEnd"/>
-      <w:r>
-        <w:rPr>
-          <w:rFonts w:ascii="Arial" w:hAnsi="Arial" w:cs="Arial"/>
-          <w:sz w:val="24"/>
-          <w:szCs w:val="24"/>
-        </w:rPr>
-        <w:t xml:space="preserve"> foi acusada de manter relaç</w:t>
+        <w:t xml:space="preserve"> dividida de modo análogo? Não causa admiração saber que a mãe de Leibnitz foi acusada de manter relaç</w:t>
       </w:r>
       <w:r>
         <w:rPr>
@@ -3323,25 +2953,7 @@
           <w:sz w:val="24"/>
           <w:szCs w:val="24"/>
         </w:rPr>
-        <w:t xml:space="preserve">es sexuais com o Diabo e presa pela Santa Inquisição, só tendo escapado devido a que seu marido, pai de </w:t>
-      </w:r>
-      <w:proofErr w:type="spellStart"/>
-      <w:r>
-        <w:rPr>
-          <w:rFonts w:ascii="Arial" w:hAnsi="Arial" w:cs="Arial"/>
-          <w:sz w:val="24"/>
-          <w:szCs w:val="24"/>
-        </w:rPr>
-        <w:t>Leibnitz</w:t>
-      </w:r>
-      <w:proofErr w:type="spellEnd"/>
-      <w:r>
-        <w:rPr>
-          <w:rFonts w:ascii="Arial" w:hAnsi="Arial" w:cs="Arial"/>
-          <w:sz w:val="24"/>
-          <w:szCs w:val="24"/>
-        </w:rPr>
-        <w:t xml:space="preserve"> era muito influe</w:t>
+        <w:t>es sexuais com o Diabo e presa pela Santa Inquisição, só tendo escapado devido a que seu marido, pai de Leibnitz era muito influe</w:t>
       </w:r>
       <w:r>
         <w:rPr>
@@ -3383,7 +2995,7 @@
         <w:tblLook w:val="04A0" w:firstRow="1" w:lastRow="0" w:firstColumn="1" w:lastColumn="0" w:noHBand="0" w:noVBand="1"/>
       </w:tblPr>
       <w:tblGrid>
-        <w:gridCol w:w="9369"/>
+        <w:gridCol w:w="9312"/>
       </w:tblGrid>
       <w:tr>
         <w:tc>
@@ -3488,18 +3100,8 @@
                 <w:sz w:val="24"/>
                 <w:szCs w:val="24"/>
               </w:rPr>
-              <w:t xml:space="preserve">Figura 11 – Calculadora de </w:t>
+              <w:t>Figura 11 – Calculadora de Leibnitz</w:t>
             </w:r>
-            <w:proofErr w:type="spellStart"/>
-            <w:r>
-              <w:rPr>
-                <w:rFonts w:ascii="Arial" w:hAnsi="Arial" w:cs="Arial"/>
-                <w:sz w:val="24"/>
-                <w:szCs w:val="24"/>
-              </w:rPr>
-              <w:t>Leibnitz</w:t>
-            </w:r>
-            <w:proofErr w:type="spellEnd"/>
           </w:p>
           <w:p>
             <w:pPr>
@@ -3553,44 +3155,20 @@
           <w:sz w:val="24"/>
           <w:szCs w:val="24"/>
         </w:rPr>
-        <w:t xml:space="preserve">Em 1802, Joseph Marie </w:t>
-      </w:r>
-      <w:proofErr w:type="spellStart"/>
-      <w:r>
-        <w:rPr>
-          <w:rFonts w:ascii="Arial" w:hAnsi="Arial" w:cs="Arial"/>
-          <w:sz w:val="24"/>
-          <w:szCs w:val="24"/>
-        </w:rPr>
-        <w:t>Jacquard</w:t>
-      </w:r>
-      <w:proofErr w:type="spellEnd"/>
-      <w:r>
-        <w:rPr>
-          <w:rFonts w:ascii="Arial" w:hAnsi="Arial" w:cs="Arial"/>
-          <w:sz w:val="24"/>
-          <w:szCs w:val="24"/>
-        </w:rPr>
-        <w:t xml:space="preserve"> (1752-1834) mecânico francês, sugeriu controlar teares por meio de cartões perfurados que forneceriam comandos necessários para a tecelagem de padrões complicados em tecidos. Podendo ser considerada como a primeira máquina mecânica programada. Os princípios de programação por cartões perfurados foram demonstrados por </w:t>
-      </w:r>
-      <w:proofErr w:type="spellStart"/>
-      <w:r>
-        <w:rPr>
-          <w:rFonts w:ascii="Arial" w:hAnsi="Arial" w:cs="Arial"/>
-          <w:sz w:val="24"/>
-          <w:szCs w:val="24"/>
-        </w:rPr>
-        <w:t>Bouchon</w:t>
-      </w:r>
-      <w:proofErr w:type="spellEnd"/>
-      <w:r>
-        <w:rPr>
-          <w:rFonts w:ascii="Arial" w:hAnsi="Arial" w:cs="Arial"/>
-          <w:sz w:val="24"/>
-          <w:szCs w:val="24"/>
-        </w:rPr>
-        <w:t>, Falcon e Jaques entre 1725 e 1745.</w:t>
-      </w:r>
+        <w:t>Em 1802, Joseph Marie Jacquard (1752-1834) mecânico francês, sugeriu controlar teares por meio de cartões perfurados que forneceriam comandos necessários para a tecelagem de padrões complicados em tecidos. Podendo ser considerada como a primeira máquina mecânica programada. Os princípios de programação por cartões perfurados foram demonstrados por Bouchon, Falcon e Jaques entre 1725 e 1745.</w:t>
+      </w:r>
+    </w:p>
+    <w:p>
+      <w:pPr>
+        <w:spacing w:after="0" w:line="240" w:lineRule="auto"/>
+        <w:ind w:right="-1" w:firstLine="709"/>
+        <w:jc w:val="both"/>
+        <w:rPr>
+          <w:rFonts w:ascii="Arial" w:hAnsi="Arial" w:cs="Arial"/>
+          <w:sz w:val="24"/>
+          <w:szCs w:val="24"/>
+        </w:rPr>
+      </w:pPr>
     </w:p>
     <w:tbl>
       <w:tblPr>
@@ -3708,18 +3286,9 @@
                 <w:sz w:val="24"/>
                 <w:szCs w:val="24"/>
               </w:rPr>
-              <w:t xml:space="preserve">Figura 12 - Tear de </w:t>
+              <w:lastRenderedPageBreak/>
+              <w:t>Figura 12 - Tear de Jacquard</w:t>
             </w:r>
-            <w:proofErr w:type="spellStart"/>
-            <w:r>
-              <w:rPr>
-                <w:rFonts w:ascii="Arial" w:hAnsi="Arial" w:cs="Arial"/>
-                <w:sz w:val="24"/>
-                <w:szCs w:val="24"/>
-              </w:rPr>
-              <w:t>Jacquard</w:t>
-            </w:r>
-            <w:proofErr w:type="spellEnd"/>
           </w:p>
         </w:tc>
       </w:tr>
@@ -3892,7 +3461,7 @@
           <w:sz w:val="24"/>
           <w:szCs w:val="24"/>
         </w:rPr>
-        <w:t>      Charles Babbage (1792-1871), matemático e engenheiro inglês e professor da Universidade de Cambridge, analisando os erros contidos nas tabelas matemáticas, construiu um modelo para calcular tabelas de funções (logarítmicas, trigonométricas, etc.) sem o comando do operador humano, que apenas iniciava a cadeia de operações e a máquina calculava, preparando a tabela desejada. Esta máquina recebeu o nome de </w:t>
+        <w:t>Charles Babbage (1792-1871), matemático e engenheiro inglês e professor da Universidade de Cambridge, analisando os erros contidos nas tabelas matemáticas, construiu um modelo para calcular tabelas de funções (logarítmicas, trigonométricas, etc.) sem o comando do operador humano, que apenas iniciava a cadeia de operações e a máquina calculava, preparando a tabela desejada. Esta máquina recebeu o nome de </w:t>
       </w:r>
       <w:r>
         <w:rPr>
@@ -4268,7 +3837,16 @@
           <w:sz w:val="24"/>
           <w:szCs w:val="24"/>
         </w:rPr>
-        <w:t xml:space="preserve"> Byron, a primeira mulher na história do processamento de dados a criar programas de computador no mundo, que também era matemática e compreendeu o funcionamento da máquina analítica e escreveu sobre o processo da mesma, uma máquina muito mais geral que a de </w:t>
+        <w:t xml:space="preserve"> Byron, a primeira mulher na história do processamento de dados a criar programas de computador no mundo, que também era matemática e compreendeu o funcionamento da máquina analítica e escreveu sobre o processo da mesma, uma máquina </w:t>
+      </w:r>
+      <w:r>
+        <w:rPr>
+          <w:rFonts w:ascii="Arial" w:hAnsi="Arial" w:cs="Arial"/>
+          <w:sz w:val="24"/>
+          <w:szCs w:val="24"/>
+        </w:rPr>
+        <w:lastRenderedPageBreak/>
+        <w:t>muito mais geral que a de </w:t>
       </w:r>
       <w:r>
         <w:rPr>
@@ -4286,16 +3864,7 @@
           <w:sz w:val="24"/>
           <w:szCs w:val="24"/>
         </w:rPr>
-        <w:t xml:space="preserve">, que possuía unidade de controle de memória aritmética </w:t>
-      </w:r>
-      <w:r>
-        <w:rPr>
-          <w:rFonts w:ascii="Arial" w:hAnsi="Arial" w:cs="Arial"/>
-          <w:sz w:val="24"/>
-          <w:szCs w:val="24"/>
-        </w:rPr>
-        <w:lastRenderedPageBreak/>
-        <w:t xml:space="preserve">de entrada e de saída. Sua operação era comandada por um conjunto de cartões perfurados onde </w:t>
+        <w:t xml:space="preserve">, que possuía unidade de controle de memória aritmética de entrada e de saída. Sua operação era comandada por um conjunto de cartões perfurados onde </w:t>
       </w:r>
       <w:r>
         <w:rPr>
@@ -4763,7 +4332,27 @@
           <w:sz w:val="24"/>
           <w:szCs w:val="24"/>
         </w:rPr>
-        <w:t xml:space="preserve">Esta foi a primeira calculadora realmente comercializada com sucesso tendo sido comercializadas mais de 200 exemplares (citar livro do Moreau). Ela fazia multiplicações com o mesmo princípio da máquina de </w:t>
+        <w:t>Esta foi a primeira calculadora realmente comercializada com sucesso tendo sido comercializadas mais de 200 exemplares (citar livro do Moreau). Ela fazia multiplicações com o mesmo princípio da máquina de Leibnitz e com a assistência do usuário efetuava as divisões.</w:t>
+      </w:r>
+    </w:p>
+    <w:p>
+      <w:pPr>
+        <w:spacing w:after="0" w:line="240" w:lineRule="auto"/>
+        <w:ind w:right="-1" w:firstLine="709"/>
+        <w:jc w:val="both"/>
+        <w:rPr>
+          <w:rFonts w:ascii="Arial" w:hAnsi="Arial" w:cs="Arial"/>
+          <w:sz w:val="24"/>
+          <w:szCs w:val="24"/>
+        </w:rPr>
+      </w:pPr>
+      <w:r>
+        <w:rPr>
+          <w:rFonts w:ascii="Arial" w:hAnsi="Arial" w:cs="Arial"/>
+          <w:sz w:val="24"/>
+          <w:szCs w:val="24"/>
+        </w:rPr>
+        <w:t xml:space="preserve">Entre 1880 e 1890, o estatístico Herman </w:t>
       </w:r>
       <w:proofErr w:type="spellStart"/>
       <w:r>
@@ -4772,7 +4361,7 @@
           <w:sz w:val="24"/>
           <w:szCs w:val="24"/>
         </w:rPr>
-        <w:t>Leibnitz</w:t>
+        <w:t>Hollerith</w:t>
       </w:r>
       <w:proofErr w:type="spellEnd"/>
       <w:r>
@@ -4781,27 +4370,7 @@
           <w:sz w:val="24"/>
           <w:szCs w:val="24"/>
         </w:rPr>
-        <w:t xml:space="preserve"> e com a assistência do usuário efetuava as divisões.</w:t>
-      </w:r>
-    </w:p>
-    <w:p>
-      <w:pPr>
-        <w:spacing w:after="0" w:line="240" w:lineRule="auto"/>
-        <w:ind w:right="-1" w:firstLine="709"/>
-        <w:jc w:val="both"/>
-        <w:rPr>
-          <w:rFonts w:ascii="Arial" w:hAnsi="Arial" w:cs="Arial"/>
-          <w:sz w:val="24"/>
-          <w:szCs w:val="24"/>
-        </w:rPr>
-      </w:pPr>
-      <w:r>
-        <w:rPr>
-          <w:rFonts w:ascii="Arial" w:hAnsi="Arial" w:cs="Arial"/>
-          <w:sz w:val="24"/>
-          <w:szCs w:val="24"/>
-        </w:rPr>
-        <w:t xml:space="preserve">Entre 1880 e 1890, o estatístico Herman </w:t>
+        <w:t xml:space="preserve"> (1860-1929), filho de imigrante alemão, inspirado nos cartões perfurados de Jacquard, usando cartolina especial, construiu um dispositivo que foi início das máquinas mecanográficas ou </w:t>
       </w:r>
       <w:proofErr w:type="spellStart"/>
       <w:r>
@@ -4810,6 +4379,24 @@
           <w:sz w:val="24"/>
           <w:szCs w:val="24"/>
         </w:rPr>
+        <w:t>tabuladoras</w:t>
+      </w:r>
+      <w:proofErr w:type="spellEnd"/>
+      <w:r>
+        <w:rPr>
+          <w:rFonts w:ascii="Arial" w:hAnsi="Arial" w:cs="Arial"/>
+          <w:sz w:val="24"/>
+          <w:szCs w:val="24"/>
+        </w:rPr>
+        <w:t xml:space="preserve">, que acelerou o processamento dos dados do censo dos EUA. Os dados eram perfurados em cartões e automaticamente tabulados usando máquinas projetadas. O censo anterior levou 7 anos e meio para ser concluído, </w:t>
+      </w:r>
+      <w:proofErr w:type="spellStart"/>
+      <w:r>
+        <w:rPr>
+          <w:rFonts w:ascii="Arial" w:hAnsi="Arial" w:cs="Arial"/>
+          <w:sz w:val="24"/>
+          <w:szCs w:val="24"/>
+        </w:rPr>
         <w:t>Hollerith</w:t>
       </w:r>
       <w:proofErr w:type="spellEnd"/>
@@ -4819,7 +4406,27 @@
           <w:sz w:val="24"/>
           <w:szCs w:val="24"/>
         </w:rPr>
-        <w:t xml:space="preserve"> (1860-1929), filho de imigrante alemão, inspirado nos cartões perfurados de </w:t>
+        <w:t xml:space="preserve"> conseguiu realizar este senso em três anos e meio. Por causa disto, muitas organizações de grande porte começaram a usar a máquina.</w:t>
+      </w:r>
+    </w:p>
+    <w:p>
+      <w:pPr>
+        <w:spacing w:after="0" w:line="240" w:lineRule="auto"/>
+        <w:ind w:right="-1" w:firstLine="709"/>
+        <w:jc w:val="both"/>
+        <w:rPr>
+          <w:rFonts w:ascii="Arial" w:hAnsi="Arial" w:cs="Arial"/>
+          <w:sz w:val="24"/>
+          <w:szCs w:val="24"/>
+        </w:rPr>
+      </w:pPr>
+      <w:r>
+        <w:rPr>
+          <w:rFonts w:ascii="Arial" w:hAnsi="Arial" w:cs="Arial"/>
+          <w:sz w:val="24"/>
+          <w:szCs w:val="24"/>
+        </w:rPr>
+        <w:t xml:space="preserve">O nome de </w:t>
       </w:r>
       <w:proofErr w:type="spellStart"/>
       <w:r>
@@ -4828,7 +4435,7 @@
           <w:sz w:val="24"/>
           <w:szCs w:val="24"/>
         </w:rPr>
-        <w:t>Jacquard</w:t>
+        <w:t>Hollerith</w:t>
       </w:r>
       <w:proofErr w:type="spellEnd"/>
       <w:r>
@@ -4837,7 +4444,27 @@
           <w:sz w:val="24"/>
           <w:szCs w:val="24"/>
         </w:rPr>
-        <w:t xml:space="preserve">, usando cartolina especial, construiu um dispositivo que foi início das máquinas mecanográficas ou </w:t>
+        <w:t xml:space="preserve"> continua associado ao cartão perfurado, que foi até o final da década de 80, símbolo quase universal do processamento automatizado de dados.</w:t>
+      </w:r>
+    </w:p>
+    <w:p>
+      <w:pPr>
+        <w:spacing w:after="0" w:line="240" w:lineRule="auto"/>
+        <w:ind w:right="-1" w:firstLine="709"/>
+        <w:jc w:val="both"/>
+        <w:rPr>
+          <w:rFonts w:ascii="Arial" w:hAnsi="Arial" w:cs="Arial"/>
+          <w:sz w:val="24"/>
+          <w:szCs w:val="24"/>
+        </w:rPr>
+      </w:pPr>
+      <w:r>
+        <w:rPr>
+          <w:rFonts w:ascii="Arial" w:hAnsi="Arial" w:cs="Arial"/>
+          <w:sz w:val="24"/>
+          <w:szCs w:val="24"/>
+        </w:rPr>
+        <w:t xml:space="preserve">Durante a década de 1890, </w:t>
       </w:r>
       <w:proofErr w:type="spellStart"/>
       <w:r>
@@ -4846,7 +4473,7 @@
           <w:sz w:val="24"/>
           <w:szCs w:val="24"/>
         </w:rPr>
-        <w:t>tabuladoras</w:t>
+        <w:t>Hollerith</w:t>
       </w:r>
       <w:proofErr w:type="spellEnd"/>
       <w:r>
@@ -4855,7 +4482,7 @@
           <w:sz w:val="24"/>
           <w:szCs w:val="24"/>
         </w:rPr>
-        <w:t xml:space="preserve">, que acelerou o processamento dos dados do censo dos EUA. Os dados eram perfurados em cartões e automaticamente tabulados usando máquinas projetadas. O censo anterior levou 7 anos e meio para ser concluído, </w:t>
+        <w:t xml:space="preserve"> saiu da Agência de Censo e fundou a empresa </w:t>
       </w:r>
       <w:proofErr w:type="spellStart"/>
       <w:r>
@@ -4864,7 +4491,7 @@
           <w:sz w:val="24"/>
           <w:szCs w:val="24"/>
         </w:rPr>
-        <w:t>Hollerith</w:t>
+        <w:t>Tabulating</w:t>
       </w:r>
       <w:proofErr w:type="spellEnd"/>
       <w:r>
@@ -4873,27 +4500,7 @@
           <w:sz w:val="24"/>
           <w:szCs w:val="24"/>
         </w:rPr>
-        <w:t xml:space="preserve"> conseguiu realizar este senso em três anos e meio. Por causa disto, muitas organizações de grande porte começaram a usar a máquina.</w:t>
-      </w:r>
-    </w:p>
-    <w:p>
-      <w:pPr>
-        <w:spacing w:after="0" w:line="240" w:lineRule="auto"/>
-        <w:ind w:right="-1" w:firstLine="709"/>
-        <w:jc w:val="both"/>
-        <w:rPr>
-          <w:rFonts w:ascii="Arial" w:hAnsi="Arial" w:cs="Arial"/>
-          <w:sz w:val="24"/>
-          <w:szCs w:val="24"/>
-        </w:rPr>
-      </w:pPr>
-      <w:r>
-        <w:rPr>
-          <w:rFonts w:ascii="Arial" w:hAnsi="Arial" w:cs="Arial"/>
-          <w:sz w:val="24"/>
-          <w:szCs w:val="24"/>
-        </w:rPr>
-        <w:t xml:space="preserve">O nome de </w:t>
+        <w:t xml:space="preserve"> Machine </w:t>
       </w:r>
       <w:proofErr w:type="spellStart"/>
       <w:r>
@@ -4902,7 +4509,7 @@
           <w:sz w:val="24"/>
           <w:szCs w:val="24"/>
         </w:rPr>
-        <w:t>Hollerith</w:t>
+        <w:t>Company</w:t>
       </w:r>
       <w:proofErr w:type="spellEnd"/>
       <w:r>
@@ -4911,63 +4518,7 @@
           <w:sz w:val="24"/>
           <w:szCs w:val="24"/>
         </w:rPr>
-        <w:t xml:space="preserve"> continua associado ao cartão perfurado, que foi até o final da década de 80, símbolo quase universal do processamento automatizado de dados.</w:t>
-      </w:r>
-    </w:p>
-    <w:p>
-      <w:pPr>
-        <w:spacing w:after="0" w:line="240" w:lineRule="auto"/>
-        <w:ind w:right="-1" w:firstLine="709"/>
-        <w:jc w:val="both"/>
-        <w:rPr>
-          <w:rFonts w:ascii="Arial" w:hAnsi="Arial" w:cs="Arial"/>
-          <w:sz w:val="24"/>
-          <w:szCs w:val="24"/>
-        </w:rPr>
-      </w:pPr>
-      <w:r>
-        <w:rPr>
-          <w:rFonts w:ascii="Arial" w:hAnsi="Arial" w:cs="Arial"/>
-          <w:sz w:val="24"/>
-          <w:szCs w:val="24"/>
-        </w:rPr>
-        <w:t xml:space="preserve">Durante a década de 1890, </w:t>
-      </w:r>
-      <w:proofErr w:type="spellStart"/>
-      <w:r>
-        <w:rPr>
-          <w:rFonts w:ascii="Arial" w:hAnsi="Arial" w:cs="Arial"/>
-          <w:sz w:val="24"/>
-          <w:szCs w:val="24"/>
-        </w:rPr>
-        <w:t>Hollerith</w:t>
-      </w:r>
-      <w:proofErr w:type="spellEnd"/>
-      <w:r>
-        <w:rPr>
-          <w:rFonts w:ascii="Arial" w:hAnsi="Arial" w:cs="Arial"/>
-          <w:sz w:val="24"/>
-          <w:szCs w:val="24"/>
-        </w:rPr>
-        <w:t xml:space="preserve"> saiu da Agência de Censo e fundou a empresa </w:t>
-      </w:r>
-      <w:proofErr w:type="spellStart"/>
-      <w:r>
-        <w:rPr>
-          <w:rFonts w:ascii="Arial" w:hAnsi="Arial" w:cs="Arial"/>
-          <w:sz w:val="24"/>
-          <w:szCs w:val="24"/>
-        </w:rPr>
-        <w:t>Tabulating</w:t>
-      </w:r>
-      <w:proofErr w:type="spellEnd"/>
-      <w:r>
-        <w:rPr>
-          <w:rFonts w:ascii="Arial" w:hAnsi="Arial" w:cs="Arial"/>
-          <w:sz w:val="24"/>
-          <w:szCs w:val="24"/>
-        </w:rPr>
-        <w:t xml:space="preserve"> Machine Company, que em 1924 junto a outras empresas para formar a </w:t>
+        <w:t xml:space="preserve">, que em 1924 junto a outras empresas para formar a </w:t>
       </w:r>
       <w:proofErr w:type="spellStart"/>
       <w:r>
@@ -5073,7 +4624,16 @@
           <w:sz w:val="24"/>
           <w:szCs w:val="24"/>
         </w:rPr>
-        <w:t> (filho) sucessor. Watson criou como símbolo de sua empresa o lema THINK “Pensar”. Hoje es</w:t>
+        <w:t xml:space="preserve"> (filho) sucessor. Watson criou </w:t>
+      </w:r>
+      <w:r>
+        <w:rPr>
+          <w:rFonts w:ascii="Arial" w:hAnsi="Arial" w:cs="Arial"/>
+          <w:sz w:val="24"/>
+          <w:szCs w:val="24"/>
+        </w:rPr>
+        <w:lastRenderedPageBreak/>
+        <w:t>como símbolo de sua empresa o lema THINK “Pensar”. Hoje es</w:t>
       </w:r>
       <w:r>
         <w:rPr>
@@ -5125,7 +4685,6 @@
           <w:sz w:val="24"/>
           <w:szCs w:val="24"/>
         </w:rPr>
-        <w:lastRenderedPageBreak/>
         <w:br/>
       </w:r>
     </w:p>
@@ -6242,8 +5801,8 @@
         <w:tblLook w:val="04A0" w:firstRow="1" w:lastRow="0" w:firstColumn="1" w:lastColumn="0" w:noHBand="0" w:noVBand="1"/>
       </w:tblPr>
       <w:tblGrid>
-        <w:gridCol w:w="4269"/>
-        <w:gridCol w:w="5185"/>
+        <w:gridCol w:w="4205"/>
+        <w:gridCol w:w="5107"/>
       </w:tblGrid>
       <w:tr>
         <w:tc>
@@ -6625,6 +6184,20 @@
           <w:szCs w:val="24"/>
         </w:rPr>
       </w:pPr>
+    </w:p>
+    <w:p>
+      <w:pPr>
+        <w:spacing w:after="0" w:line="240" w:lineRule="auto"/>
+        <w:ind w:right="-1" w:firstLine="709"/>
+        <w:jc w:val="both"/>
+        <w:rPr>
+          <w:rFonts w:ascii="Arial" w:hAnsi="Arial" w:cs="Arial"/>
+          <w:b/>
+          <w:bCs/>
+          <w:sz w:val="24"/>
+          <w:szCs w:val="24"/>
+        </w:rPr>
+      </w:pPr>
       <w:r>
         <w:rPr>
           <w:rFonts w:ascii="Arial" w:hAnsi="Arial" w:cs="Arial"/>
@@ -6858,7 +6431,6 @@
                 <w:sz w:val="24"/>
                 <w:szCs w:val="24"/>
               </w:rPr>
-              <w:lastRenderedPageBreak/>
               <w:drawing>
                 <wp:inline distT="0" distB="0" distL="0" distR="0" wp14:anchorId="4AA59EBC" wp14:editId="72F09595">
                   <wp:extent cx="3228975" cy="2514600"/>
@@ -7113,20 +6685,20 @@
           <w:sz w:val="24"/>
           <w:szCs w:val="24"/>
         </w:rPr>
-        <w:t xml:space="preserve"> computer </w:t>
-      </w:r>
-      <w:r>
-        <w:rPr>
-          <w:rFonts w:ascii="Arial" w:hAnsi="Arial" w:cs="Arial"/>
-          <w:b/>
-          <w:bCs/>
+        <w:t xml:space="preserve"> </w:t>
+      </w:r>
+      <w:proofErr w:type="spellStart"/>
+      <w:r>
+        <w:rPr>
+          <w:rFonts w:ascii="Arial" w:hAnsi="Arial" w:cs="Arial"/>
           <w:i/>
           <w:iCs/>
           <w:sz w:val="24"/>
           <w:szCs w:val="24"/>
         </w:rPr>
-        <w:t>0</w:t>
-      </w:r>
+        <w:t>computer</w:t>
+      </w:r>
+      <w:proofErr w:type="spellEnd"/>
       <w:r>
         <w:rPr>
           <w:rFonts w:ascii="Arial" w:hAnsi="Arial" w:cs="Arial"/>
@@ -7135,40 +6707,62 @@
           <w:sz w:val="24"/>
           <w:szCs w:val="24"/>
         </w:rPr>
-        <w:t>), </w:t>
-      </w:r>
-      <w:r>
-        <w:rPr>
-          <w:rFonts w:ascii="Arial" w:hAnsi="Arial" w:cs="Arial"/>
-          <w:sz w:val="24"/>
-          <w:szCs w:val="24"/>
-        </w:rPr>
-        <w:t>computador transistorizado, para realizar diferentes tipos de experiências. A maior novidade do TX-0, foi que cada transistor foi colocad</w:t>
-      </w:r>
-      <w:r>
-        <w:rPr>
-          <w:rFonts w:ascii="Arial" w:hAnsi="Arial" w:cs="Arial"/>
-          <w:sz w:val="24"/>
-          <w:szCs w:val="24"/>
-        </w:rPr>
-        <w:t>o</w:t>
-      </w:r>
-      <w:r>
-        <w:rPr>
-          <w:rFonts w:ascii="Arial" w:hAnsi="Arial" w:cs="Arial"/>
-          <w:sz w:val="24"/>
-          <w:szCs w:val="24"/>
-        </w:rPr>
-        <w:t xml:space="preserve"> numa “garrafa”, onde simulava os tubos a vácuo que facilitou o trabalho. Esta máquina serviu de base para o </w:t>
-      </w:r>
-      <w:r>
-        <w:rPr>
-          <w:rFonts w:ascii="Arial" w:hAnsi="Arial" w:cs="Arial"/>
+        <w:t> </w:t>
+      </w:r>
+      <w:r>
+        <w:rPr>
+          <w:rFonts w:ascii="Arial" w:hAnsi="Arial" w:cs="Arial"/>
+          <w:b/>
+          <w:bCs/>
           <w:i/>
           <w:iCs/>
           <w:sz w:val="24"/>
           <w:szCs w:val="24"/>
         </w:rPr>
+        <w:t>0</w:t>
+      </w:r>
+      <w:r>
+        <w:rPr>
+          <w:rFonts w:ascii="Arial" w:hAnsi="Arial" w:cs="Arial"/>
+          <w:i/>
+          <w:iCs/>
+          <w:sz w:val="24"/>
+          <w:szCs w:val="24"/>
+        </w:rPr>
+        <w:t>), </w:t>
+      </w:r>
+      <w:r>
+        <w:rPr>
+          <w:rFonts w:ascii="Arial" w:hAnsi="Arial" w:cs="Arial"/>
+          <w:sz w:val="24"/>
+          <w:szCs w:val="24"/>
+        </w:rPr>
+        <w:t>computador transistorizado, para realizar diferentes tipos de experiências. A maior novidade do TX-0, foi que cada transistor foi colocad</w:t>
+      </w:r>
+      <w:r>
+        <w:rPr>
+          <w:rFonts w:ascii="Arial" w:hAnsi="Arial" w:cs="Arial"/>
+          <w:sz w:val="24"/>
+          <w:szCs w:val="24"/>
+        </w:rPr>
+        <w:t>o</w:t>
+      </w:r>
+      <w:r>
+        <w:rPr>
+          <w:rFonts w:ascii="Arial" w:hAnsi="Arial" w:cs="Arial"/>
+          <w:sz w:val="24"/>
+          <w:szCs w:val="24"/>
+        </w:rPr>
+        <w:t xml:space="preserve"> numa “garrafa”, onde simulava os tubos a vácuo que facilitou o trabalho. Esta máquina serviu de base para o </w:t>
+      </w:r>
+      <w:r>
+        <w:rPr>
+          <w:rFonts w:ascii="Arial" w:hAnsi="Arial" w:cs="Arial"/>
+          <w:i/>
+          <w:iCs/>
+          <w:sz w:val="24"/>
+          <w:szCs w:val="24"/>
+        </w:rPr>
         <w:t>TX-2</w:t>
       </w:r>
       <w:r>
@@ -7179,6 +6773,18 @@
         </w:rPr>
         <w:t>, uma versão melhorada que não significou muito.</w:t>
       </w:r>
+    </w:p>
+    <w:p>
+      <w:pPr>
+        <w:spacing w:after="0" w:line="240" w:lineRule="auto"/>
+        <w:ind w:right="-1" w:firstLine="709"/>
+        <w:jc w:val="both"/>
+        <w:rPr>
+          <w:rFonts w:ascii="Arial" w:hAnsi="Arial" w:cs="Arial"/>
+          <w:sz w:val="24"/>
+          <w:szCs w:val="24"/>
+        </w:rPr>
+      </w:pPr>
     </w:p>
     <w:tbl>
       <w:tblPr>
@@ -7639,7 +7245,16 @@
           <w:sz w:val="24"/>
           <w:szCs w:val="24"/>
         </w:rPr>
-        <w:t>colocou milhões de transistores em uma única pastilha, surgindo computadores menores e mais potentes. Nesta época, começou a era dos computadores pessoais.</w:t>
+        <w:t xml:space="preserve">colocou milhões de transistores em uma única pastilha, surgindo </w:t>
+      </w:r>
+      <w:r>
+        <w:rPr>
+          <w:rFonts w:ascii="Arial" w:hAnsi="Arial" w:cs="Arial"/>
+          <w:sz w:val="24"/>
+          <w:szCs w:val="24"/>
+        </w:rPr>
+        <w:lastRenderedPageBreak/>
+        <w:t>computadores menores e mais potentes. Nesta época, começou a era dos computadores pessoais.</w:t>
       </w:r>
     </w:p>
     <w:p>
@@ -7685,7 +7300,6 @@
           <w:sz w:val="28"/>
           <w:szCs w:val="28"/>
         </w:rPr>
-        <w:lastRenderedPageBreak/>
         <w:t>As primeiras máquinas no brasil</w:t>
       </w:r>
       <w:bookmarkEnd w:id="7"/>
@@ -7721,16 +7335,14 @@
         </w:rPr>
         <w:t xml:space="preserve">Em 1960, chega ao Brasil o primeiro computador comercial, que foi comprado com fundos vindo em grande parte do CNPq, e colaboração técnica do </w:t>
       </w:r>
-      <w:proofErr w:type="spellStart"/>
-      <w:r>
-        <w:rPr>
-          <w:rFonts w:ascii="Arial" w:hAnsi="Arial" w:cs="Arial"/>
-          <w:sz w:val="24"/>
-          <w:szCs w:val="24"/>
-        </w:rPr>
-        <w:t>Exercito</w:t>
-      </w:r>
-      <w:proofErr w:type="spellEnd"/>
+      <w:r>
+        <w:rPr>
+          <w:rFonts w:ascii="Arial" w:hAnsi="Arial" w:cs="Arial"/>
+          <w:sz w:val="24"/>
+          <w:szCs w:val="24"/>
+        </w:rPr>
+        <w:t>Exército</w:t>
+      </w:r>
       <w:r>
         <w:rPr>
           <w:rFonts w:ascii="Arial" w:hAnsi="Arial" w:cs="Arial"/>
@@ -8180,25 +7792,8 @@
           <w:sz w:val="24"/>
           <w:szCs w:val="24"/>
         </w:rPr>
-        <w:t xml:space="preserve">A primeira máquina mecânica programável foi introduzida pelo matemático francês Joseph-Marie </w:t>
-      </w:r>
-      <w:proofErr w:type="spellStart"/>
-      <w:r>
-        <w:rPr>
-          <w:rFonts w:ascii="Arial" w:hAnsi="Arial" w:cs="Arial"/>
-          <w:sz w:val="24"/>
-          <w:szCs w:val="24"/>
-        </w:rPr>
-        <w:t>Jacquard</w:t>
-      </w:r>
-      <w:proofErr w:type="spellEnd"/>
-      <w:r>
-        <w:rPr>
-          <w:rFonts w:ascii="Arial" w:hAnsi="Arial" w:cs="Arial"/>
-          <w:sz w:val="24"/>
-          <w:szCs w:val="24"/>
-        </w:rPr>
-        <w:t>. Tratava-se de um tipo de tear capaz de controlar a confecção dos tecidos através de cartões perfurados.</w:t>
+        <w:lastRenderedPageBreak/>
+        <w:t>A primeira máquina mecânica programável foi introduzida pelo matemático francês Joseph-Marie Jacquard. Tratava-se de um tipo de tear capaz de controlar a confecção dos tecidos através de cartões perfurados.</w:t>
       </w:r>
     </w:p>
     <w:p>
@@ -8238,7 +7833,6 @@
           <w:sz w:val="24"/>
           <w:szCs w:val="24"/>
         </w:rPr>
-        <w:lastRenderedPageBreak/>
         <w:t>Já no século XIX, o matemático inglês Charles Babbage criou uma máquina analítica que, a grosso modo, é comparada com o computador atual com memória e programas.</w:t>
       </w:r>
     </w:p>
@@ -8529,6 +8123,7 @@
         </w:rPr>
         <w:t> </w:t>
       </w:r>
+      <w:proofErr w:type="spellStart"/>
       <w:r>
         <w:rPr>
           <w:rFonts w:ascii="Arial" w:hAnsi="Arial" w:cs="Arial"/>
@@ -8539,6 +8134,7 @@
         </w:rPr>
         <w:t>and</w:t>
       </w:r>
+      <w:proofErr w:type="spellEnd"/>
       <w:r>
         <w:rPr>
           <w:rFonts w:ascii="Arial" w:hAnsi="Arial" w:cs="Arial"/>
@@ -8565,6 +8161,18 @@
         </w:rPr>
         <w:t>) que consumia cerca de 200 quilowatts e possuía 19.000 válvulas.</w:t>
       </w:r>
+    </w:p>
+    <w:p>
+      <w:pPr>
+        <w:spacing w:after="0" w:line="240" w:lineRule="auto"/>
+        <w:ind w:right="-1" w:firstLine="709"/>
+        <w:jc w:val="both"/>
+        <w:rPr>
+          <w:rFonts w:ascii="Arial" w:hAnsi="Arial" w:cs="Arial"/>
+          <w:sz w:val="24"/>
+          <w:szCs w:val="24"/>
+        </w:rPr>
+      </w:pPr>
     </w:p>
     <w:p>
       <w:pPr>
@@ -8717,7 +8325,35 @@
           <w:szCs w:val="24"/>
           <w:u w:val="single"/>
         </w:rPr>
-        <w:t> and Computer)</w:t>
+        <w:t> </w:t>
+      </w:r>
+      <w:proofErr w:type="spellStart"/>
+      <w:r>
+        <w:rPr>
+          <w:rFonts w:ascii="Arial" w:hAnsi="Arial" w:cs="Arial"/>
+          <w:b/>
+          <w:bCs/>
+          <w:i/>
+          <w:iCs/>
+          <w:sz w:val="24"/>
+          <w:szCs w:val="24"/>
+          <w:u w:val="single"/>
+        </w:rPr>
+        <w:t>and</w:t>
+      </w:r>
+      <w:proofErr w:type="spellEnd"/>
+      <w:r>
+        <w:rPr>
+          <w:rFonts w:ascii="Arial" w:hAnsi="Arial" w:cs="Arial"/>
+          <w:b/>
+          <w:bCs/>
+          <w:i/>
+          <w:iCs/>
+          <w:sz w:val="24"/>
+          <w:szCs w:val="24"/>
+          <w:u w:val="single"/>
+        </w:rPr>
+        <w:t> Computer)</w:t>
       </w:r>
     </w:p>
     <w:p>
@@ -9671,7 +9307,7 @@
     <w:p>
       <w:pPr>
         <w:spacing w:after="0" w:line="240" w:lineRule="auto"/>
-        <w:ind w:right="-1" w:firstLine="709"/>
+        <w:ind w:right="-1"/>
         <w:jc w:val="both"/>
         <w:rPr>
           <w:rFonts w:ascii="Arial" w:hAnsi="Arial" w:cs="Arial"/>
@@ -10082,25 +9718,7 @@
           <w:sz w:val="24"/>
           <w:szCs w:val="24"/>
         </w:rPr>
-        <w:t xml:space="preserve">A primeira máquina mecânica programável foi introduzida pelo matemático francês Joseph-Marie </w:t>
-      </w:r>
-      <w:proofErr w:type="spellStart"/>
-      <w:r>
-        <w:rPr>
-          <w:rFonts w:ascii="Arial" w:hAnsi="Arial" w:cs="Arial"/>
-          <w:sz w:val="24"/>
-          <w:szCs w:val="24"/>
-        </w:rPr>
-        <w:t>Jacquard</w:t>
-      </w:r>
-      <w:proofErr w:type="spellEnd"/>
-      <w:r>
-        <w:rPr>
-          <w:rFonts w:ascii="Arial" w:hAnsi="Arial" w:cs="Arial"/>
-          <w:sz w:val="24"/>
-          <w:szCs w:val="24"/>
-        </w:rPr>
-        <w:t>. Tratava-se de um tipo de tear capaz de controlar a confecção dos tecidos através de cartões perfurados.</w:t>
+        <w:t>A primeira máquina mecânica programável foi introduzida pelo matemático francês Joseph-Marie Jacquard. Tratava-se de um tipo de tear capaz de controlar a confecção dos tecidos através de cartões perfurados.</w:t>
       </w:r>
     </w:p>
     <w:p>
@@ -10343,7 +9961,25 @@
           <w:sz w:val="24"/>
           <w:szCs w:val="24"/>
         </w:rPr>
-        <w:t xml:space="preserve"> and Computer) que consumia cerca de 200 quilowatts e possuía 19.000 válvulas.</w:t>
+        <w:t xml:space="preserve"> </w:t>
+      </w:r>
+      <w:proofErr w:type="spellStart"/>
+      <w:r>
+        <w:rPr>
+          <w:rFonts w:ascii="Arial" w:hAnsi="Arial" w:cs="Arial"/>
+          <w:sz w:val="24"/>
+          <w:szCs w:val="24"/>
+        </w:rPr>
+        <w:t>and</w:t>
+      </w:r>
+      <w:proofErr w:type="spellEnd"/>
+      <w:r>
+        <w:rPr>
+          <w:rFonts w:ascii="Arial" w:hAnsi="Arial" w:cs="Arial"/>
+          <w:sz w:val="24"/>
+          <w:szCs w:val="24"/>
+        </w:rPr>
+        <w:t xml:space="preserve"> Computer) que consumia cerca de 200 quilowatts e possuía 19.000 válvulas.</w:t>
       </w:r>
     </w:p>
     <w:p>
@@ -11618,7 +11254,7 @@
     </w:p>
     <w:sectPr>
       <w:pgSz w:w="11906" w:h="16838"/>
-      <w:pgMar w:top="993" w:right="991" w:bottom="851" w:left="851" w:header="708" w:footer="708" w:gutter="0"/>
+      <w:pgMar w:top="993" w:right="991" w:bottom="851" w:left="993" w:header="708" w:footer="708" w:gutter="0"/>
       <w:cols w:space="708"/>
       <w:docGrid w:linePitch="360"/>
     </w:sectPr>

</xml_diff>